<commit_message>
sambios a mi parte del speech
</commit_message>
<xml_diff>
--- a/Speech.docx
+++ b/Speech.docx
@@ -9,15 +9,7 @@
     </w:p>
     <w:p>
       <w:r>
-        <w:t xml:space="preserve">Buenos días a todos, mi nombre es Francisco Rosales y este es mi compañero Omar </w:t>
-      </w:r>
-      <w:proofErr w:type="spellStart"/>
-      <w:r>
-        <w:t>Tox</w:t>
-      </w:r>
-      <w:proofErr w:type="spellEnd"/>
-      <w:r>
-        <w:t>, les venimos a presentar nuestro proyecto Soluciones energéticas para redes de sensores: eficiencia y sustentabilidad</w:t>
+        <w:t>Buenos días a todos, mi nombre es Francisco Rosales y este es mi compañero Omar Tox, les venimos a presentar nuestro proyecto Soluciones energéticas para redes de sensores: eficiencia y sustentabilidad</w:t>
       </w:r>
     </w:p>
     <w:p>
@@ -48,10 +40,7 @@
         <w:t>poder monitorearlos</w:t>
       </w:r>
       <w:r>
-        <w:t xml:space="preserve"> o </w:t>
-      </w:r>
-      <w:r>
-        <w:t>estudiarlos</w:t>
+        <w:t xml:space="preserve"> o estudiarlos</w:t>
       </w:r>
       <w:r>
         <w:t>. El problema crítico es que funcionan con baterías. Hoy en día, cuando la batería se agota, el nodo muere, se pierden datos y el costo de ir a reemplazarla es</w:t>
@@ -74,25 +63,13 @@
         <w:t>Es i</w:t>
       </w:r>
       <w:r>
-        <w:t xml:space="preserve">mportante realizar este proyecto porque </w:t>
+        <w:t xml:space="preserve">mportante este proyecto porque </w:t>
       </w:r>
       <w:r>
         <w:t>sirve</w:t>
       </w:r>
       <w:r>
-        <w:t xml:space="preserve"> </w:t>
-      </w:r>
-      <w:r>
-        <w:t xml:space="preserve">no solo de utilidad </w:t>
-      </w:r>
-      <w:r>
-        <w:t>nosotros</w:t>
-      </w:r>
-      <w:r>
-        <w:t xml:space="preserve">, sino también </w:t>
-      </w:r>
-      <w:r>
-        <w:t>para los proyectos que se realizan en el CITQROO</w:t>
+        <w:t xml:space="preserve"> para los proyectos que se realizan en el CITQROO</w:t>
       </w:r>
       <w:r>
         <w:t xml:space="preserve"> que es donde realizamos nuestra residencia</w:t>
@@ -101,22 +78,7 @@
         <w:t xml:space="preserve">, </w:t>
       </w:r>
       <w:r>
-        <w:t>as</w:t>
-      </w:r>
-      <w:r>
-        <w:t>í</w:t>
-      </w:r>
-      <w:r>
-        <w:t xml:space="preserve"> como en otros proyectos</w:t>
-      </w:r>
-      <w:r>
-        <w:t xml:space="preserve"> de otras instancias</w:t>
-      </w:r>
-      <w:r>
-        <w:t xml:space="preserve"> que buscan innovar</w:t>
-      </w:r>
-      <w:r>
-        <w:t>, como ejemplo tenemos este que hace unos años</w:t>
+        <w:t>como ejemplo tenemos este que hace unos años</w:t>
       </w:r>
       <w:r>
         <w:t xml:space="preserve"> había</w:t>
@@ -131,15 +93,7 @@
         <w:t xml:space="preserve">pias </w:t>
       </w:r>
       <w:r>
-        <w:t xml:space="preserve">aquí en el </w:t>
-      </w:r>
-      <w:proofErr w:type="spellStart"/>
-      <w:r>
-        <w:t>itch</w:t>
-      </w:r>
-      <w:proofErr w:type="spellEnd"/>
-      <w:r>
-        <w:t xml:space="preserve"> </w:t>
+        <w:t xml:space="preserve">aquí en el itch </w:t>
       </w:r>
       <w:r>
         <w:t>y se monitoreó</w:t>
@@ -157,50 +111,47 @@
         <w:t xml:space="preserve">muy poco </w:t>
       </w:r>
       <w:r>
-        <w:t>y por ello no se pudo seguir llevando a cabo, consideramos que el aprovechar la sinergia del hardware con el software reducirá el consumo, además el uso de energías renovables como la solar será de utilidad para aumentar la autonomía del nodo, haciendo que duren más</w:t>
+        <w:t xml:space="preserve">y por ello no se pudo seguir llevando a cabo, consideramos que el aprovechar la sinergia del hardware con el software </w:t>
+      </w:r>
+      <w:r>
+        <w:t>junto con energías renovables aumentará la autonomía delos nosod y hará que más proyectos pasen a la industria</w:t>
+      </w:r>
+    </w:p>
+    <w:p/>
+    <w:p>
+      <w:r>
+        <w:t>OBJETIVOS</w:t>
+      </w:r>
+    </w:p>
+    <w:p>
+      <w:r>
+        <w:t>por ello, nuestro objetivo general fue optimizar el consumo energético mediante código, protocolos de bajo consumo y fuentes renovables</w:t>
+      </w:r>
+    </w:p>
+    <w:p>
+      <w:r>
+        <w:t>Para lograrlo, nos plantea</w:t>
+      </w:r>
+      <w:r>
+        <w:t>mo</w:t>
+      </w:r>
+      <w:r>
+        <w:t>s 3 objetivos específicos:</w:t>
+      </w:r>
+    </w:p>
+    <w:p>
+      <w:r>
+        <w:t>Evaluar el consumo energético actual</w:t>
+      </w:r>
+    </w:p>
+    <w:p>
+      <w:r>
+        <w:t>Desarrollar algoritmos de gestión energética</w:t>
       </w:r>
       <w:r>
         <w:t xml:space="preserve">, </w:t>
       </w:r>
       <w:r>
-        <w:t>más proyectos pasen de la fase del prototipado y se desperdicien menos baterías que contaminan tanto</w:t>
-      </w:r>
-    </w:p>
-    <w:p/>
-    <w:p>
-      <w:r>
-        <w:t>OBJETIVOS</w:t>
-      </w:r>
-    </w:p>
-    <w:p>
-      <w:r>
-        <w:t>por ello, nuestro objetivo general fue optimizar el consumo energético mediante código, protocolos de bajo consumo y fuentes renovables</w:t>
-      </w:r>
-    </w:p>
-    <w:p>
-      <w:r>
-        <w:t>Para lograrlo, nos plantea</w:t>
-      </w:r>
-      <w:r>
-        <w:t>mo</w:t>
-      </w:r>
-      <w:r>
-        <w:t>s 3 objetivos específicos:</w:t>
-      </w:r>
-    </w:p>
-    <w:p>
-      <w:r>
-        <w:t>Evaluar el consumo energético actual</w:t>
-      </w:r>
-    </w:p>
-    <w:p>
-      <w:r>
-        <w:t>Desarrollar algoritmos de gestión energética</w:t>
-      </w:r>
-      <w:r>
-        <w:t xml:space="preserve">, </w:t>
-      </w:r>
-      <w:r>
         <w:t xml:space="preserve">optimizando </w:t>
       </w:r>
       <w:r>
@@ -227,13 +178,9 @@
     </w:p>
     <w:p>
       <w:r>
-        <w:t>Comparar la eficiencia energética de diferentes estrategias de comunicación</w:t>
-      </w:r>
-      <w:r>
-        <w:t xml:space="preserve"> </w:t>
-      </w:r>
-    </w:p>
-    <w:p/>
+        <w:t>Evaluar el uso de paneles solares para lograr autonomía energética</w:t>
+      </w:r>
+    </w:p>
     <w:p/>
     <w:p>
       <w:r>
@@ -248,15 +195,7 @@
     </w:p>
     <w:p>
       <w:r>
-        <w:t xml:space="preserve">Anteriormente, en 2016 </w:t>
-      </w:r>
-      <w:proofErr w:type="spellStart"/>
-      <w:r>
-        <w:t>Sediguimanesh</w:t>
-      </w:r>
-      <w:proofErr w:type="spellEnd"/>
-      <w:r>
-        <w:t xml:space="preserve"> y compañía, s</w:t>
+        <w:t>Anteriormente, en 2016 Sediguimanesh y compañía, s</w:t>
       </w:r>
       <w:r>
         <w:t>imularon un esquema en el que los nodos solo despiertan en intervalos específicos para enviar datos y duermen el resto del tiempo</w:t>
@@ -290,52 +229,58 @@
         <w:t xml:space="preserve">maquinaria </w:t>
       </w:r>
       <w:r>
-        <w:t>en una empresa, nosotros tomamos como base este proyecto porque ya estuvo en una etapa de implementación y demuestra que se ha usado, sobre este proyecto base planteamos las mejoras y los cambios a realizar, sin embargo, nuestro proyecto es general y sirve para cualquier red de sensores</w:t>
-      </w:r>
-    </w:p>
-    <w:p>
-      <w:r>
-        <w:t xml:space="preserve">Utilizamos diferentes radios para comunicación como Lora, </w:t>
-      </w:r>
-      <w:proofErr w:type="spellStart"/>
-      <w:r>
-        <w:t>xbee</w:t>
-      </w:r>
-      <w:proofErr w:type="spellEnd"/>
+        <w:t xml:space="preserve">en una empresa, nosotros </w:t>
+      </w:r>
+      <w:r>
+        <w:t>realizamos las mejoras sobre este</w:t>
+      </w:r>
+      <w:r>
+        <w:t>, sin embargo, nuestro proyecto es general y sirve para cualquier red de sensores</w:t>
+      </w:r>
+      <w:r>
+        <w:t xml:space="preserve"> basada en Arduino </w:t>
+      </w:r>
+    </w:p>
+    <w:p>
+      <w:r>
+        <w:t>Utilizamos diferentes radios para comunicación como Lora, xbee y nrf con capacidades y ventajas</w:t>
+      </w:r>
+      <w:r>
+        <w:t xml:space="preserve"> </w:t>
+      </w:r>
+      <w:r>
+        <w:t>diferentes</w:t>
+      </w:r>
+      <w:r>
+        <w:t>, cada uno con sus propi</w:t>
+      </w:r>
+      <w:r>
+        <w:t>os</w:t>
+      </w:r>
+      <w:r>
+        <w:t xml:space="preserve"> protocolos como ZigBee</w:t>
+      </w:r>
+      <w:r>
+        <w:t xml:space="preserve">, </w:t>
+      </w:r>
+      <w:r>
+        <w:t>LoRaWAN</w:t>
+      </w:r>
       <w:r>
         <w:t xml:space="preserve"> y </w:t>
       </w:r>
-      <w:proofErr w:type="spellStart"/>
-      <w:r>
-        <w:t>nrf</w:t>
-      </w:r>
-      <w:proofErr w:type="spellEnd"/>
-      <w:r>
-        <w:t xml:space="preserve"> que son distintos radios con capacidades y ventajas y desventajas diferentes</w:t>
-      </w:r>
-      <w:r>
-        <w:t xml:space="preserve">, que son radios comerciales para transmisión de datos cada uno con sus propias características y protocolos como ZigBee y </w:t>
-      </w:r>
-      <w:proofErr w:type="spellStart"/>
-      <w:r>
-        <w:t>LoRaWAN</w:t>
-      </w:r>
-      <w:proofErr w:type="spellEnd"/>
+      <w:r>
+        <w:t>ESB</w:t>
+      </w:r>
+    </w:p>
+    <w:p>
+      <w:r>
+        <w:t>En base a nuestros antecedentes nosotros trabajamos generando herramientas de compresión de datos y ciclo de trabajo</w:t>
+      </w:r>
     </w:p>
     <w:p/>
     <w:p>
       <w:r>
-        <w:t>En base a nuestros antecedentes nosotros trabajamos generando herramientas de compresión de datos y ciclo de trabajo</w:t>
-      </w:r>
-    </w:p>
-    <w:p>
-      <w:r>
-        <w:t>A su vez utilizamos paneles solares para recolección de energía y evaluar la posible autonomía indefinida de los nodos sensores</w:t>
-      </w:r>
-    </w:p>
-    <w:p/>
-    <w:p>
-      <w:r>
         <w:t>ACTIVIDADES</w:t>
       </w:r>
     </w:p>
@@ -346,7 +291,13 @@
     </w:p>
     <w:p>
       <w:r>
-        <w:t>Entrando en la metodología, atacamos primero el hardware</w:t>
+        <w:t>Entrando en l</w:t>
+      </w:r>
+      <w:r>
+        <w:t>o que hicimos</w:t>
+      </w:r>
+      <w:r>
+        <w:t>, atacamos primero el hardware</w:t>
       </w:r>
     </w:p>
     <w:p>
@@ -382,80 +333,32 @@
         <w:t>,</w:t>
       </w:r>
       <w:r>
-        <w:t xml:space="preserve"> para </w:t>
-      </w:r>
-      <w:proofErr w:type="gramStart"/>
-      <w:r>
-        <w:t xml:space="preserve">los </w:t>
-      </w:r>
-      <w:r>
-        <w:t>nodo</w:t>
-      </w:r>
-      <w:proofErr w:type="gramEnd"/>
+        <w:t xml:space="preserve"> para</w:t>
+      </w:r>
+      <w:r>
+        <w:t xml:space="preserve"> reducir el consumo energético</w:t>
+      </w:r>
       <w:r>
         <w:t xml:space="preserve"> </w:t>
       </w:r>
-      <w:r>
-        <w:t xml:space="preserve">sensores </w:t>
-      </w:r>
-      <w:r>
-        <w:t xml:space="preserve">ya que consume menos, </w:t>
-      </w:r>
-      <w:r>
-        <w:t xml:space="preserve">y </w:t>
-      </w:r>
-      <w:r>
-        <w:rPr>
-          <w:b/>
-          <w:bCs/>
-        </w:rPr>
-        <w:t>ESP32</w:t>
-      </w:r>
-      <w:r>
-        <w:rPr>
-          <w:b/>
-          <w:bCs/>
-        </w:rPr>
+    </w:p>
+    <w:p>
+      <w:pPr>
+        <w:tabs>
+          <w:tab w:val="num" w:pos="720"/>
+        </w:tabs>
+      </w:pPr>
+      <w:r>
+        <w:t>En cuanto a la regulación energética, r</w:t>
+      </w:r>
+      <w:r>
+        <w:t xml:space="preserve">eemplazamos los reguladores lineales </w:t>
+      </w:r>
+      <w:r>
         <w:t xml:space="preserve"> </w:t>
       </w:r>
       <w:r>
-        <w:t>para el coordinador, optimizando la capacidad de proceso</w:t>
-      </w:r>
-      <w:r>
-        <w:t xml:space="preserve"> ya que es más poderoso</w:t>
-      </w:r>
-      <w:r>
-        <w:t>.</w:t>
-      </w:r>
-      <w:r>
-        <w:t xml:space="preserve"> </w:t>
-      </w:r>
-    </w:p>
-    <w:p>
-      <w:pPr>
-        <w:tabs>
-          <w:tab w:val="num" w:pos="720"/>
-        </w:tabs>
-      </w:pPr>
-      <w:r>
-        <w:t>En cuanto a la regulación energética, r</w:t>
-      </w:r>
-      <w:r>
-        <w:t xml:space="preserve">eemplazamos los reguladores </w:t>
-      </w:r>
-      <w:proofErr w:type="gramStart"/>
-      <w:r>
-        <w:t xml:space="preserve">lineales </w:t>
-      </w:r>
-      <w:r>
-        <w:t xml:space="preserve"> </w:t>
-      </w:r>
-      <w:r>
-        <w:t>MB</w:t>
-      </w:r>
-      <w:proofErr w:type="gramEnd"/>
-      <w:r>
-        <w:t xml:space="preserve">102 </w:t>
+        <w:t xml:space="preserve">MB102 </w:t>
       </w:r>
       <w:r>
         <w:t xml:space="preserve"> </w:t>
@@ -490,10 +393,56 @@
         <w:t>T</w:t>
       </w:r>
       <w:r>
-        <w:t xml:space="preserve">ambién realizamos un </w:t>
-      </w:r>
-      <w:r>
-        <w:t>Corte Físico: Implementamos un circuito con MOSFETs que nos permite 'cortar' físicamente la corriente de los sensores cuando no están midiendo.</w:t>
+        <w:t>ambién</w:t>
+      </w:r>
+      <w:r>
+        <w:t xml:space="preserve"> Implementamos un circuito con MOSFETs que nos permite 'cortar' físicamente la corriente de los sensores cuando no están midiendo.</w:t>
+      </w:r>
+    </w:p>
+    <w:p>
+      <w:pPr>
+        <w:tabs>
+          <w:tab w:val="num" w:pos="720"/>
+        </w:tabs>
+      </w:pPr>
+      <w:r>
+        <w:t xml:space="preserve">En este caso un MOSFET es un componente que usamos como un interruptor electrónico, estos consumen muy poca energía para trabajar y se desgastan mucho menos que otros componentes </w:t>
+      </w:r>
+      <w:r>
+        <w:t>con usos similares</w:t>
+      </w:r>
+    </w:p>
+    <w:p>
+      <w:pPr>
+        <w:tabs>
+          <w:tab w:val="num" w:pos="720"/>
+        </w:tabs>
+      </w:pPr>
+      <w:r>
+        <w:t>DIAP 2</w:t>
+      </w:r>
+    </w:p>
+    <w:p>
+      <w:pPr>
+        <w:tabs>
+          <w:tab w:val="num" w:pos="720"/>
+        </w:tabs>
+      </w:pPr>
+      <w:r>
+        <w:t>estábamos trabajando con diferentes radios</w:t>
+      </w:r>
+    </w:p>
+    <w:p>
+      <w:pPr>
+        <w:tabs>
+          <w:tab w:val="num" w:pos="720"/>
+        </w:tabs>
+      </w:pPr>
+      <w:r>
+        <w:t>Y como cada radio necesita diferente configuración pero tienen las mismas funciones optamos por crear una herramienta de abstracción de radios, para simplificar la llamada a sus funcionalidades que todos tienen como el inicializar, dormir, enviar y leer</w:t>
+      </w:r>
+      <w:r>
+        <w:t xml:space="preserve">  generando así código más limpio y escalable</w:t>
       </w:r>
     </w:p>
     <w:p>
@@ -504,57 +453,6 @@
       </w:pPr>
       <w:r>
         <w:lastRenderedPageBreak/>
-        <w:t xml:space="preserve">En este caso un MOSFET es un componente que usamos como un interruptor electrónico, estos consumen muy poca energía para trabajar y se desgastan mucho menos que otros componentes </w:t>
-      </w:r>
-      <w:r>
-        <w:t>similares</w:t>
-      </w:r>
-    </w:p>
-    <w:p>
-      <w:pPr>
-        <w:tabs>
-          <w:tab w:val="num" w:pos="720"/>
-        </w:tabs>
-      </w:pPr>
-      <w:r>
-        <w:t>DIAP 2</w:t>
-      </w:r>
-    </w:p>
-    <w:p>
-      <w:pPr>
-        <w:tabs>
-          <w:tab w:val="num" w:pos="720"/>
-        </w:tabs>
-      </w:pPr>
-      <w:r>
-        <w:t>estábamos trabajando con diferentes radios</w:t>
-      </w:r>
-    </w:p>
-    <w:p>
-      <w:pPr>
-        <w:tabs>
-          <w:tab w:val="num" w:pos="720"/>
-        </w:tabs>
-      </w:pPr>
-      <w:r>
-        <w:t xml:space="preserve">Y como cada radio necesita diferente </w:t>
-      </w:r>
-      <w:proofErr w:type="gramStart"/>
-      <w:r>
-        <w:t>configuración</w:t>
-      </w:r>
-      <w:proofErr w:type="gramEnd"/>
-      <w:r>
-        <w:t xml:space="preserve"> pero tienen las mismas funciones optamos por crear una herramienta de abstracción de radios, para simplificar la llamada a sus funcionalidades que todos tienen como el inicializar, dormir, enviar y leer</w:t>
-      </w:r>
-    </w:p>
-    <w:p>
-      <w:pPr>
-        <w:tabs>
-          <w:tab w:val="num" w:pos="720"/>
-        </w:tabs>
-      </w:pPr>
-      <w:r>
         <w:t>DIAP 3</w:t>
       </w:r>
     </w:p>
@@ -581,15 +479,7 @@
         </w:tabs>
       </w:pPr>
       <w:r>
-        <w:t xml:space="preserve">Creamos </w:t>
-      </w:r>
-      <w:proofErr w:type="spellStart"/>
-      <w:r>
-        <w:t>Codec</w:t>
-      </w:r>
-      <w:proofErr w:type="spellEnd"/>
-      <w:r>
-        <w:t xml:space="preserve"> para comprimir el tamaño del paquete </w:t>
+        <w:t xml:space="preserve">Creamos Codec para comprimir el tamaño del paquete </w:t>
       </w:r>
     </w:p>
     <w:p>
@@ -642,15 +532,7 @@
         <w:t>renovables</w:t>
       </w:r>
       <w:r>
-        <w:t xml:space="preserve"> realizamos pruebas entre </w:t>
-      </w:r>
-      <w:proofErr w:type="gramStart"/>
-      <w:r>
-        <w:t>paneles  PV</w:t>
-      </w:r>
-      <w:proofErr w:type="gramEnd"/>
-      <w:r>
-        <w:t>-RI-35 Y CNC16X13 para evaluar su desempeño bajo diferentes condiciones tales como la demanda máxima de consumo del sistema, estados de obstrucción parcial de la luz y el estado máximo de generación del panel</w:t>
+        <w:t xml:space="preserve"> realizamos pruebas entre paneles  PV-RI-35 Y CNC16X13 para evaluar su desempeño bajo diferentes condiciones tales como la demanda máxima de consumo del sistema, estados de obstrucción parcial de la luz y el estado máximo de generación del panel</w:t>
       </w:r>
     </w:p>
     <w:p>
@@ -712,39 +594,16 @@
         </w:tabs>
       </w:pPr>
       <w:r>
-        <w:t xml:space="preserve">Aquí podemos ver las fotos de nuestros nodos cada uno con diferente radio, como son </w:t>
-      </w:r>
-      <w:proofErr w:type="spellStart"/>
-      <w:r>
-        <w:t>xbee</w:t>
-      </w:r>
-      <w:proofErr w:type="spellEnd"/>
-      <w:r>
-        <w:t xml:space="preserve">, lora, y </w:t>
-      </w:r>
-      <w:proofErr w:type="spellStart"/>
-      <w:proofErr w:type="gramStart"/>
-      <w:r>
-        <w:t>nrf,</w:t>
-      </w:r>
-      <w:r>
-        <w:t>como</w:t>
-      </w:r>
-      <w:proofErr w:type="spellEnd"/>
-      <w:proofErr w:type="gramEnd"/>
-      <w:r>
-        <w:t xml:space="preserve"> pueden ver,</w:t>
+        <w:t>Aquí podemos ver las fotos de nuestros nodos cada uno con diferente radio, como son xbee, lora, y nrf,</w:t>
+      </w:r>
+      <w:r>
+        <w:t>como pueden ver,</w:t>
       </w:r>
       <w:r>
         <w:t xml:space="preserve"> todos estos usaban el mismo código de configuración utilizando nuestra herramienta </w:t>
       </w:r>
-      <w:proofErr w:type="spellStart"/>
-      <w:r>
-        <w:t>UniversalRadioWSN</w:t>
-      </w:r>
-      <w:proofErr w:type="spellEnd"/>
-      <w:r>
-        <w:t xml:space="preserve"> de esta manera solo cambiamos una línea para prepararlo para diferente hardware </w:t>
+      <w:r>
+        <w:t xml:space="preserve">UniversalRadioWSN de esta manera solo cambiamos una línea para prepararlo para diferente hardware </w:t>
       </w:r>
       <w:r>
         <w:t xml:space="preserve"> </w:t>
@@ -767,14 +626,146 @@
         </w:tabs>
       </w:pPr>
       <w:r>
-        <w:t xml:space="preserve">Librería </w:t>
-      </w:r>
-      <w:proofErr w:type="spellStart"/>
-      <w:proofErr w:type="gramStart"/>
-      <w:r>
-        <w:t>UniversalRadioWSN</w:t>
-      </w:r>
-      <w:proofErr w:type="spellEnd"/>
+        <w:t>Librería UniversalRadioWSN,</w:t>
+      </w:r>
+      <w:r>
+        <w:t xml:space="preserve"> </w:t>
+      </w:r>
+      <w:r>
+        <w:t xml:space="preserve"> como resultado tenemos la librería universal radio que es genérica para los módulos de radio que ya mencionamos y est</w:t>
+      </w:r>
+      <w:r>
+        <w:t>a</w:t>
+      </w:r>
+      <w:r>
+        <w:t xml:space="preserve"> a su vez es extensible Y se puede crecer para implementar otro tipo de radios</w:t>
+      </w:r>
+    </w:p>
+    <w:p>
+      <w:pPr>
+        <w:tabs>
+          <w:tab w:val="num" w:pos="720"/>
+        </w:tabs>
+      </w:pPr>
+      <w:r>
+        <w:t>DIAP4</w:t>
+      </w:r>
+    </w:p>
+    <w:p>
+      <w:pPr>
+        <w:tabs>
+          <w:tab w:val="num" w:pos="720"/>
+        </w:tabs>
+      </w:pPr>
+      <w:r>
+        <w:t>Tenemos la librería codec que se creó para poder contactar los datos a un formato binario con lo cual el tamaño del mensaje que se envía comparado a prototipos básicos se ve reducido hasta el 70% lo que reducen mucho el tiempo de transmisión y por lo tanto reduce el consumo de energía, A su vez dentro de esta misma librería implementamos algoritmos de verificación del mensaje para saber si nuestro mensaje se vio corrompido durante el envío o si le faltan partes para evitar sesgo</w:t>
+      </w:r>
+      <w:r>
+        <w:t>.</w:t>
+      </w:r>
+    </w:p>
+    <w:p>
+      <w:pPr>
+        <w:tabs>
+          <w:tab w:val="num" w:pos="720"/>
+        </w:tabs>
+      </w:pPr>
+      <w:r>
+        <w:t>DIAP5</w:t>
+      </w:r>
+    </w:p>
+    <w:p>
+      <w:pPr>
+        <w:tabs>
+          <w:tab w:val="num" w:pos="720"/>
+        </w:tabs>
+      </w:pPr>
+      <w:r>
+        <w:t>También tenemos nuestra librería EnergyWSN, La cual se encarga de gestionar las órdenes de encendido o apagado dadas por el programa haciendo que tanto el microprocesador como la radio en tener un modo de sueño profundo y corten la energía a La línea de sensores para evitar que estos tengan corrientes parásitos</w:t>
+      </w:r>
+    </w:p>
+    <w:p>
+      <w:pPr>
+        <w:tabs>
+          <w:tab w:val="num" w:pos="720"/>
+        </w:tabs>
+      </w:pPr>
+    </w:p>
+    <w:p>
+      <w:pPr>
+        <w:tabs>
+          <w:tab w:val="num" w:pos="720"/>
+        </w:tabs>
+      </w:pPr>
+      <w:r>
+        <w:t>DIAP6</w:t>
+      </w:r>
+    </w:p>
+    <w:p>
+      <w:pPr>
+        <w:tabs>
+          <w:tab w:val="num" w:pos="720"/>
+        </w:tabs>
+      </w:pPr>
+      <w:r>
+        <w:t xml:space="preserve">Dado que todas Estas son herramientas que su función es poder aplicarse fácilmente a otros proyectos nosotros pedimos la iniciativa de hacerlos públicos a través del IDE oficial de Arduino, Con lo cual nos aseguramos de poder llegar a más personas que requieran optimización energética en sus redes de sensores </w:t>
+      </w:r>
+    </w:p>
+    <w:p>
+      <w:pPr>
+        <w:tabs>
+          <w:tab w:val="num" w:pos="720"/>
+        </w:tabs>
+      </w:pPr>
+      <w:r>
+        <w:t>METODOLOGIA</w:t>
+      </w:r>
+    </w:p>
+    <w:p>
+      <w:pPr>
+        <w:tabs>
+          <w:tab w:val="num" w:pos="720"/>
+        </w:tabs>
+      </w:pPr>
+      <w:r>
+        <w:t xml:space="preserve">Para la evaluación del resultado de estas mejores al sistema, Realizamos mediciones del consumo de corriente de todos nuestros modos probando las diferentes estrategias de software y los </w:t>
+      </w:r>
+      <w:r>
+        <w:lastRenderedPageBreak/>
+        <w:t>diferentes hardware y radios con el objetivo de evaluar qué tanto mejoró el consumo tanto en modo de reposo así como el modo de trabajo y obtener la autonomía estimada de cada una de las variantes</w:t>
+      </w:r>
+    </w:p>
+    <w:p>
+      <w:pPr>
+        <w:tabs>
+          <w:tab w:val="num" w:pos="720"/>
+        </w:tabs>
+      </w:pPr>
+      <w:r>
+        <w:t>Como podemos ver en esta gráfica ,en el nodo más básico que era el nodo base utilizando la radio LoRa, obteníamos 2 días y medio de autonomía y el mejor resultado que obtuvimos nos da 38 días de autonomía aplicando todas nuestras mejoras tanto de hardware como de software</w:t>
+      </w:r>
+    </w:p>
+    <w:p>
+      <w:r>
+        <w:t>A su vez en esta diapositiva pueden ver un análisis en el que comparamos la reducción del tiempo de trabajo de El nodo basado en hora aplicando la librería codec que hace que la radio trabaje menos tiempo, Como se puede apreciar obtuvimos 50% menos de tiempo de trabajo usando la radio LoRa  y en los otros una reducción de más del 70%.  Lo que nos confirma que la reducción del tamaño del paquete a enviar, realmente es muy importante para reducir el consumo y aumentar la autonomía energética</w:t>
+      </w:r>
+    </w:p>
+    <w:p/>
+    <w:p>
+      <w:r>
+        <w:t>CONCLUSIÓN</w:t>
+      </w:r>
+    </w:p>
+    <w:p>
+      <w:r>
+        <w:t xml:space="preserve">La realización de estas herramientas servirán de guía y apoyo a que más proyectos tanto del </w:t>
+      </w:r>
+      <w:r>
+        <w:t xml:space="preserve">Centro de Innovación, </w:t>
+      </w:r>
+      <w:r>
+        <w:t xml:space="preserve"> como en general pasen de la fase de prototipado</w:t>
+      </w:r>
       <w:r>
         <w:t>,</w:t>
       </w:r>
@@ -782,246 +773,53 @@
         <w:t xml:space="preserve"> </w:t>
       </w:r>
       <w:r>
-        <w:t xml:space="preserve"> como</w:t>
-      </w:r>
-      <w:proofErr w:type="gramEnd"/>
-      <w:r>
-        <w:t xml:space="preserve"> resultado tenemos la librería universal radio que es genérica para los módulos de radio que ya mencionamos y est</w:t>
-      </w:r>
-      <w:r>
-        <w:t>a</w:t>
-      </w:r>
-      <w:r>
-        <w:t xml:space="preserve"> a su vez es extensible Y se puede crecer para implementar otro tipo de radios</w:t>
-      </w:r>
-    </w:p>
-    <w:p>
-      <w:pPr>
-        <w:tabs>
-          <w:tab w:val="num" w:pos="720"/>
-        </w:tabs>
-      </w:pPr>
-      <w:r>
-        <w:t>DIAP4</w:t>
-      </w:r>
-    </w:p>
-    <w:p>
-      <w:pPr>
-        <w:tabs>
-          <w:tab w:val="num" w:pos="720"/>
-        </w:tabs>
-      </w:pPr>
-      <w:r>
-        <w:t xml:space="preserve">Tenemos la librería </w:t>
-      </w:r>
-      <w:proofErr w:type="spellStart"/>
-      <w:r>
-        <w:t>codec</w:t>
-      </w:r>
-      <w:proofErr w:type="spellEnd"/>
-      <w:r>
-        <w:t xml:space="preserve"> que se creó para poder contactar los datos a un formato binario con lo cual el tamaño del mensaje que se envía comparado a prototipos básicos se ve reducido hasta el 70% lo que reducen mucho el tiempo de transmisión y por lo tanto reduce el consumo de energía, A su vez dentro de esta misma librería implementamos algoritmos de verificación del mensaje para saber si nuestro mensaje se vio corrompido durante el envío o si le faltan partes para evitar sesgo</w:t>
+        <w:t>y</w:t>
+      </w:r>
+      <w:r>
+        <w:t xml:space="preserve">a que se crearon con una </w:t>
+      </w:r>
+      <w:r>
+        <w:t>m</w:t>
+      </w:r>
+      <w:r>
+        <w:t>etodología que apunta a que sean fáciles de implementar, reutilizables y escalables</w:t>
       </w:r>
       <w:r>
         <w:t>.</w:t>
       </w:r>
     </w:p>
     <w:p>
-      <w:pPr>
-        <w:tabs>
-          <w:tab w:val="num" w:pos="720"/>
-        </w:tabs>
-      </w:pPr>
-      <w:r>
-        <w:t>DIAP5</w:t>
-      </w:r>
-    </w:p>
-    <w:p>
-      <w:pPr>
-        <w:tabs>
-          <w:tab w:val="num" w:pos="720"/>
-        </w:tabs>
-      </w:pPr>
-      <w:r>
-        <w:t>También tenemos nuestra librería EnergyWSN, La cual se encarga de gestionar las órdenes de encendido o apagado dadas por el programa haciendo que tanto el microprocesador como la radio en tener un modo de sueño profundo y corten la energía a La línea de sensores para evitar que estos tengan corrientes parásitos</w:t>
-      </w:r>
-    </w:p>
-    <w:p>
-      <w:pPr>
-        <w:tabs>
-          <w:tab w:val="num" w:pos="720"/>
-        </w:tabs>
-      </w:pPr>
-    </w:p>
-    <w:p>
-      <w:pPr>
-        <w:tabs>
-          <w:tab w:val="num" w:pos="720"/>
-        </w:tabs>
-      </w:pPr>
-      <w:r>
-        <w:t>DIAP6</w:t>
-      </w:r>
-    </w:p>
-    <w:p>
-      <w:pPr>
-        <w:tabs>
-          <w:tab w:val="num" w:pos="720"/>
-        </w:tabs>
-      </w:pPr>
-      <w:r>
-        <w:t xml:space="preserve">Dado que todas Estas son herramientas que su función es poder aplicarse fácilmente a otros proyectos nosotros pedimos la iniciativa de hacerlos públicos a través del IDE oficial de Arduino, Con lo cual nos aseguramos de poder llegar a más personas que requieran optimización energética en sus redes de sensores </w:t>
-      </w:r>
-    </w:p>
-    <w:p>
-      <w:pPr>
-        <w:tabs>
-          <w:tab w:val="num" w:pos="720"/>
-        </w:tabs>
-      </w:pPr>
-      <w:r>
-        <w:t>METODOLOGIA</w:t>
-      </w:r>
-    </w:p>
-    <w:p>
-      <w:pPr>
-        <w:tabs>
-          <w:tab w:val="num" w:pos="720"/>
-        </w:tabs>
-      </w:pPr>
-      <w:r>
-        <w:t xml:space="preserve">Para la evaluación del resultado de estas mejores al sistema, Realizamos mediciones del consumo de corriente de todos nuestros modos probando las diferentes estrategias de software y los </w:t>
-      </w:r>
-      <w:r>
-        <w:lastRenderedPageBreak/>
-        <w:t xml:space="preserve">diferentes hardware y radios con el objetivo de evaluar qué tanto mejoró el consumo tanto en modo de </w:t>
-      </w:r>
-      <w:proofErr w:type="gramStart"/>
-      <w:r>
-        <w:t>reposo</w:t>
-      </w:r>
-      <w:proofErr w:type="gramEnd"/>
-      <w:r>
-        <w:t xml:space="preserve"> así como el modo de trabajo y obtener la autonomía estimada de cada una de las variantes</w:t>
-      </w:r>
-    </w:p>
-    <w:p>
-      <w:pPr>
-        <w:tabs>
-          <w:tab w:val="num" w:pos="720"/>
-        </w:tabs>
-      </w:pPr>
-      <w:r>
-        <w:t xml:space="preserve">Como podemos ver en esta </w:t>
-      </w:r>
-      <w:proofErr w:type="gramStart"/>
-      <w:r>
-        <w:t>gráfica ,en</w:t>
-      </w:r>
-      <w:proofErr w:type="gramEnd"/>
-      <w:r>
-        <w:t xml:space="preserve"> el nodo más básico que era el nodo base utilizando la radio LoRa, obteníamos 2 días y medio de autonomía y el mejor resultado que obtuvimos nos da 38 días de autonomía aplicando todas nuestras mejoras tanto de hardware como de software</w:t>
-      </w:r>
-    </w:p>
-    <w:p>
-      <w:r>
-        <w:t xml:space="preserve">A su vez en esta diapositiva pueden ver un análisis en el que comparamos la reducción del tiempo de trabajo de El nodo basado en hora aplicando la librería </w:t>
-      </w:r>
-      <w:proofErr w:type="spellStart"/>
-      <w:r>
-        <w:t>codec</w:t>
-      </w:r>
-      <w:proofErr w:type="spellEnd"/>
-      <w:r>
-        <w:t xml:space="preserve"> que hace que la radio trabaje menos tiempo, Como se puede apreciar obtuvimos 50% menos de tiempo de trabajo usando la radio </w:t>
-      </w:r>
-      <w:proofErr w:type="gramStart"/>
-      <w:r>
-        <w:t>LoRa  y</w:t>
-      </w:r>
-      <w:proofErr w:type="gramEnd"/>
-      <w:r>
-        <w:t xml:space="preserve"> en los otros una reducción de más del 70%.  Lo que nos confirma que la reducción del tamaño del paquete a enviar, realmente es muy importante para reducir el consumo y aumentar la autonomía energética</w:t>
-      </w:r>
-    </w:p>
-    <w:p/>
-    <w:p>
-      <w:r>
-        <w:t>CONCLUSIÓN</w:t>
-      </w:r>
-    </w:p>
-    <w:p>
-      <w:r>
-        <w:t xml:space="preserve">La realización de estas herramientas servirán de guía y apoyo a que más proyectos tanto del </w:t>
-      </w:r>
-      <w:r>
-        <w:t xml:space="preserve">Centro de </w:t>
-      </w:r>
-      <w:proofErr w:type="gramStart"/>
-      <w:r>
-        <w:t xml:space="preserve">Innovación, </w:t>
-      </w:r>
-      <w:r>
-        <w:t xml:space="preserve"> como</w:t>
-      </w:r>
-      <w:proofErr w:type="gramEnd"/>
-      <w:r>
-        <w:t xml:space="preserve"> en general pasen de la fase de prototipado</w:t>
+      <w:r>
+        <w:t xml:space="preserve"> </w:t>
+      </w:r>
+      <w:r>
+        <w:t>C</w:t>
+      </w:r>
+      <w:r>
+        <w:t>omo pudimos ver</w:t>
       </w:r>
       <w:r>
         <w:t>,</w:t>
       </w:r>
       <w:r>
-        <w:t xml:space="preserve"> </w:t>
-      </w:r>
-      <w:r>
-        <w:t>y</w:t>
-      </w:r>
-      <w:r>
-        <w:t xml:space="preserve">a que se crearon con una </w:t>
-      </w:r>
-      <w:r>
-        <w:t>m</w:t>
-      </w:r>
-      <w:r>
-        <w:t>etodología que apunta a que sean fáciles de implementar, reutilizables y escalables</w:t>
-      </w:r>
-      <w:r>
-        <w:t>.</w:t>
-      </w:r>
-    </w:p>
-    <w:p>
-      <w:r>
-        <w:t xml:space="preserve"> </w:t>
-      </w:r>
-      <w:r>
-        <w:t>C</w:t>
-      </w:r>
-      <w:r>
-        <w:t>omo pudimos ver</w:t>
+        <w:t xml:space="preserve"> estas herramientas de código en colaboración con el hardware más eficiente como el regulador MP1584 y el MOSFET realmente redujeron el consumo energético de los nodos. De igual manera, corroboramos </w:t>
+      </w:r>
+      <w:r>
+        <w:t xml:space="preserve">que </w:t>
+      </w:r>
+      <w:r>
+        <w:t>el uso de paneles</w:t>
+      </w:r>
+      <w:r>
+        <w:t xml:space="preserve">, </w:t>
+      </w:r>
+      <w:r>
+        <w:t>como el PV-Rl-35</w:t>
       </w:r>
       <w:r>
         <w:t>,</w:t>
       </w:r>
       <w:r>
-        <w:t xml:space="preserve"> estas herramientas de código en colaboración con el hardware más eficiente como el regulador MP1584 y el MOSFET realmente redujeron el consumo energético de los nodos. De igual manera, corroboramos </w:t>
-      </w:r>
-      <w:r>
-        <w:t xml:space="preserve">que </w:t>
-      </w:r>
-      <w:r>
-        <w:t>el uso de paneles</w:t>
-      </w:r>
-      <w:r>
-        <w:t xml:space="preserve">, </w:t>
-      </w:r>
-      <w:r>
-        <w:t>como el PV-Rl-35</w:t>
-      </w:r>
-      <w:r>
-        <w:t>,</w:t>
-      </w:r>
-      <w:r>
         <w:t xml:space="preserve"> logró alimentar eficientemente los diferentes nodos incluso en situaciones de poca iluminación promoviendo una autonomía indefinida</w:t>
       </w:r>
       <w:r>
@@ -1035,49 +833,17 @@
     </w:p>
     <w:p>
       <w:r>
-        <w:t xml:space="preserve">Para el trabajo futuro nosotros recomendamos el reemplazo </w:t>
-      </w:r>
-      <w:proofErr w:type="gramStart"/>
-      <w:r>
-        <w:t>del reguladores</w:t>
-      </w:r>
-      <w:proofErr w:type="gramEnd"/>
-      <w:r>
-        <w:t xml:space="preserve"> sensores que nosotros utilizamos de bajo de costo por unos componentes </w:t>
-      </w:r>
-      <w:proofErr w:type="spellStart"/>
-      <w:r>
-        <w:t>procrecionales</w:t>
-      </w:r>
-      <w:proofErr w:type="spellEnd"/>
-      <w:r>
-        <w:t xml:space="preserve"> los cuales son más durables y eficientes energéticamente, </w:t>
-      </w:r>
-    </w:p>
-    <w:p>
-      <w:r>
-        <w:t xml:space="preserve">A su vez se puede mejorar el que la librería </w:t>
-      </w:r>
-      <w:proofErr w:type="spellStart"/>
-      <w:r>
-        <w:t>adapteive</w:t>
-      </w:r>
-      <w:proofErr w:type="spellEnd"/>
-      <w:r>
-        <w:t xml:space="preserve"> no solo reaccione al voltaje de la batería sino también a la energía que está disponible por el panel solar es decir que en días nublados transmita menos y en días soleados transmita más</w:t>
-      </w:r>
-    </w:p>
-    <w:p>
-      <w:r>
-        <w:t xml:space="preserve">A su </w:t>
-      </w:r>
-      <w:proofErr w:type="gramStart"/>
-      <w:r>
-        <w:t>vez ,</w:t>
-      </w:r>
-      <w:proofErr w:type="gramEnd"/>
-      <w:r>
-        <w:t xml:space="preserve"> para un proyecto específico que ya se vaya a implementar, se recomienda arduamente diseñar una placa de circuito impreso personalizada ya que es más estable además de que reduce el tamaño y se tiene un mayor control</w:t>
+        <w:t xml:space="preserve">Para el trabajo futuro nosotros recomendamos el reemplazo del reguladores sensores que nosotros utilizamos de bajo de costo por unos componentes procrecionales los cuales son más durables y eficientes energéticamente, </w:t>
+      </w:r>
+    </w:p>
+    <w:p>
+      <w:r>
+        <w:t>A su vez se puede mejorar el que la librería adapteive no solo reaccione al voltaje de la batería sino también a la energía que está disponible por el panel solar es decir que en días nublados transmita menos y en días soleados transmita más</w:t>
+      </w:r>
+    </w:p>
+    <w:p>
+      <w:r>
+        <w:t>A su vez , para un proyecto específico que ya se vaya a implementar, se recomienda arduamente diseñar una placa de circuito impreso personalizada ya que es más estable además de que reduce el tamaño y se tiene un mayor control</w:t>
       </w:r>
     </w:p>
     <w:p/>

</xml_diff>

<commit_message>
correcciones menores al documento
</commit_message>
<xml_diff>
--- a/Speech.docx
+++ b/Speech.docx
@@ -9,7 +9,15 @@
     </w:p>
     <w:p>
       <w:r>
-        <w:t>Buenos días a todos, mi nombre es Francisco Rosales y este es mi compañero Omar Tox, les venimos a presentar nuestro proyecto Soluciones energéticas para redes de sensores: eficiencia y sustentabilidad</w:t>
+        <w:t xml:space="preserve">Buenos días a todos, mi nombre es Francisco Rosales y este es mi compañero Omar </w:t>
+      </w:r>
+      <w:proofErr w:type="spellStart"/>
+      <w:r>
+        <w:t>Tox</w:t>
+      </w:r>
+      <w:proofErr w:type="spellEnd"/>
+      <w:r>
+        <w:t>, les venimos a presentar nuestro proyecto Soluciones energéticas para redes de sensores: eficiencia y sustentabilidad</w:t>
       </w:r>
     </w:p>
     <w:p>
@@ -19,22 +27,13 @@
     </w:p>
     <w:p>
       <w:r>
-        <w:t xml:space="preserve">Para comenzar, tenemos que entender qué es una Red de Sensores Inalámbricos (WSN). Básicamente, son conjuntos de dispositivos autónomos que monitorean variables como temperatura o humedad en lugares remotos, como cultivos o </w:t>
-      </w:r>
-      <w:r>
-        <w:t>cuevas</w:t>
-      </w:r>
-      <w:r>
-        <w:t>, y los envían a un</w:t>
-      </w:r>
-      <w:r>
-        <w:t xml:space="preserve"> coordinador que los sube a un servidor </w:t>
-      </w:r>
-      <w:r>
-        <w:t xml:space="preserve">o los guarda </w:t>
-      </w:r>
-      <w:r>
-        <w:t xml:space="preserve">para </w:t>
+        <w:t>Para comenzar, tenemos que entender qué es una Red de Sensores Inalámbricos (WSN). Básicamente, son conjuntos de dispositivos autónomos que monitorean variables en lugares remotos, como</w:t>
+      </w:r>
+      <w:r>
+        <w:t xml:space="preserve"> el oxígeno en el aire en una cueva o la humedad en cultivos</w:t>
+      </w:r>
+      <w:r>
+        <w:t xml:space="preserve">, para </w:t>
       </w:r>
       <w:r>
         <w:t>poder monitorearlos</w:t>
@@ -43,7 +42,13 @@
         <w:t xml:space="preserve"> o estudiarlos</w:t>
       </w:r>
       <w:r>
-        <w:t>. El problema crítico es que funcionan con baterías. Hoy en día, cuando la batería se agota, el nodo muere, se pierden datos y el costo de ir a reemplazarla es</w:t>
+        <w:t>. El problema crítico es que funcionan con baterías</w:t>
+      </w:r>
+      <w:r>
+        <w:t xml:space="preserve">, </w:t>
+      </w:r>
+      <w:r>
+        <w:t>cuando la batería se agota, el nodo muere, se pierden datos y el costo de ir a reemplazarla es</w:t>
       </w:r>
       <w:r>
         <w:t xml:space="preserve"> muy alto</w:t>
@@ -93,7 +98,15 @@
         <w:t xml:space="preserve">pias </w:t>
       </w:r>
       <w:r>
-        <w:t xml:space="preserve">aquí en el itch </w:t>
+        <w:t xml:space="preserve">aquí en el </w:t>
+      </w:r>
+      <w:proofErr w:type="spellStart"/>
+      <w:r>
+        <w:t>itch</w:t>
+      </w:r>
+      <w:proofErr w:type="spellEnd"/>
+      <w:r>
+        <w:t xml:space="preserve"> </w:t>
       </w:r>
       <w:r>
         <w:t>y se monitoreó</w:t>
@@ -114,7 +127,15 @@
         <w:t xml:space="preserve">y por ello no se pudo seguir llevando a cabo, consideramos que el aprovechar la sinergia del hardware con el software </w:t>
       </w:r>
       <w:r>
-        <w:t>junto con energías renovables aumentará la autonomía delos nosod y hará que más proyectos pasen a la industria</w:t>
+        <w:t xml:space="preserve">junto con energías renovables aumentará la autonomía delos </w:t>
+      </w:r>
+      <w:proofErr w:type="spellStart"/>
+      <w:r>
+        <w:t>nosod</w:t>
+      </w:r>
+      <w:proofErr w:type="spellEnd"/>
+      <w:r>
+        <w:t xml:space="preserve"> y hará que más proyectos pasen a la industria</w:t>
       </w:r>
     </w:p>
     <w:p/>
@@ -195,7 +216,15 @@
     </w:p>
     <w:p>
       <w:r>
-        <w:t>Anteriormente, en 2016 Sediguimanesh y compañía, s</w:t>
+        <w:t xml:space="preserve">Anteriormente, en 2016 </w:t>
+      </w:r>
+      <w:proofErr w:type="spellStart"/>
+      <w:r>
+        <w:t>Sediguimanesh</w:t>
+      </w:r>
+      <w:proofErr w:type="spellEnd"/>
+      <w:r>
+        <w:t xml:space="preserve"> y compañía, s</w:t>
       </w:r>
       <w:r>
         <w:t>imularon un esquema en el que los nodos solo despiertan en intervalos específicos para enviar datos y duermen el resto del tiempo</w:t>
@@ -206,7 +235,15 @@
         <w:t xml:space="preserve">A su vez, en </w:t>
       </w:r>
       <w:r>
-        <w:t xml:space="preserve">2022 Mishra propuso Técnicas de comprensión de datos porque mientras mas corto sea el mensaje enviado, menos tiempo está encendido el radio y </w:t>
+        <w:t xml:space="preserve">2022 Mishra propuso Técnicas de comprensión de datos porque mientras </w:t>
+      </w:r>
+      <w:proofErr w:type="spellStart"/>
+      <w:r>
+        <w:t>mas</w:t>
+      </w:r>
+      <w:proofErr w:type="spellEnd"/>
+      <w:r>
+        <w:t xml:space="preserve"> corto sea el mensaje enviado, menos tiempo está encendido el radio y </w:t>
       </w:r>
       <w:r>
         <w:t xml:space="preserve">el nodo </w:t>
@@ -243,34 +280,29 @@
     </w:p>
     <w:p>
       <w:r>
-        <w:t>Utilizamos diferentes radios para comunicación como Lora, xbee y nrf con capacidades y ventajas</w:t>
+        <w:t xml:space="preserve">Utilizamos diferentes radios para comunicación como Lora, </w:t>
+      </w:r>
+      <w:proofErr w:type="spellStart"/>
+      <w:r>
+        <w:t>xbee</w:t>
+      </w:r>
+      <w:proofErr w:type="spellEnd"/>
+      <w:r>
+        <w:t xml:space="preserve"> y </w:t>
+      </w:r>
+      <w:proofErr w:type="spellStart"/>
+      <w:r>
+        <w:t>nrf</w:t>
+      </w:r>
+      <w:proofErr w:type="spellEnd"/>
+      <w:r>
+        <w:t xml:space="preserve"> con capacidades y ventajas</w:t>
       </w:r>
       <w:r>
         <w:t xml:space="preserve"> </w:t>
       </w:r>
       <w:r>
         <w:t>diferentes</w:t>
-      </w:r>
-      <w:r>
-        <w:t>, cada uno con sus propi</w:t>
-      </w:r>
-      <w:r>
-        <w:t>os</w:t>
-      </w:r>
-      <w:r>
-        <w:t xml:space="preserve"> protocolos como ZigBee</w:t>
-      </w:r>
-      <w:r>
-        <w:t xml:space="preserve">, </w:t>
-      </w:r>
-      <w:r>
-        <w:t>LoRaWAN</w:t>
-      </w:r>
-      <w:r>
-        <w:t xml:space="preserve"> y </w:t>
-      </w:r>
-      <w:r>
-        <w:t>ESB</w:t>
       </w:r>
     </w:p>
     <w:p>
@@ -352,13 +384,21 @@
         <w:t>En cuanto a la regulación energética, r</w:t>
       </w:r>
       <w:r>
-        <w:t xml:space="preserve">eemplazamos los reguladores lineales </w:t>
+        <w:t xml:space="preserve">eemplazamos los reguladores </w:t>
+      </w:r>
+      <w:proofErr w:type="gramStart"/>
+      <w:r>
+        <w:t xml:space="preserve">lineales </w:t>
       </w:r>
       <w:r>
         <w:t xml:space="preserve"> </w:t>
       </w:r>
       <w:r>
-        <w:t xml:space="preserve">MB102 </w:t>
+        <w:t>MB</w:t>
+      </w:r>
+      <w:proofErr w:type="gramEnd"/>
+      <w:r>
+        <w:t xml:space="preserve">102 </w:t>
       </w:r>
       <w:r>
         <w:t xml:space="preserve"> </w:t>
@@ -439,10 +479,18 @@
         </w:tabs>
       </w:pPr>
       <w:r>
-        <w:t>Y como cada radio necesita diferente configuración pero tienen las mismas funciones optamos por crear una herramienta de abstracción de radios, para simplificar la llamada a sus funcionalidades que todos tienen como el inicializar, dormir, enviar y leer</w:t>
-      </w:r>
-      <w:r>
-        <w:t xml:space="preserve">  generando así código más limpio y escalable</w:t>
+        <w:t xml:space="preserve">Y como cada radio necesita diferente configuración pero tienen las mismas funciones optamos por crear una herramienta de abstracción de radios, para simplificar la llamada a sus funcionalidades que todos tienen como el inicializar, dormir, enviar y </w:t>
+      </w:r>
+      <w:proofErr w:type="gramStart"/>
+      <w:r>
+        <w:t>leer</w:t>
+      </w:r>
+      <w:r>
+        <w:t xml:space="preserve">  generando</w:t>
+      </w:r>
+      <w:proofErr w:type="gramEnd"/>
+      <w:r>
+        <w:t xml:space="preserve"> así código más limpio y escalable</w:t>
       </w:r>
     </w:p>
     <w:p>
@@ -479,7 +527,15 @@
         </w:tabs>
       </w:pPr>
       <w:r>
-        <w:t xml:space="preserve">Creamos Codec para comprimir el tamaño del paquete </w:t>
+        <w:t xml:space="preserve">Creamos </w:t>
+      </w:r>
+      <w:proofErr w:type="spellStart"/>
+      <w:r>
+        <w:t>Codec</w:t>
+      </w:r>
+      <w:proofErr w:type="spellEnd"/>
+      <w:r>
+        <w:t xml:space="preserve"> para comprimir el tamaño del paquete </w:t>
       </w:r>
     </w:p>
     <w:p>
@@ -532,7 +588,15 @@
         <w:t>renovables</w:t>
       </w:r>
       <w:r>
-        <w:t xml:space="preserve"> realizamos pruebas entre paneles  PV-RI-35 Y CNC16X13 para evaluar su desempeño bajo diferentes condiciones tales como la demanda máxima de consumo del sistema, estados de obstrucción parcial de la luz y el estado máximo de generación del panel</w:t>
+        <w:t xml:space="preserve"> realizamos pruebas entre </w:t>
+      </w:r>
+      <w:proofErr w:type="gramStart"/>
+      <w:r>
+        <w:t>paneles  PV</w:t>
+      </w:r>
+      <w:proofErr w:type="gramEnd"/>
+      <w:r>
+        <w:t>-RI-35 Y CNC16X13 para evaluar su desempeño bajo diferentes condiciones tales como la demanda máxima de consumo del sistema, estados de obstrucción parcial de la luz y el estado máximo de generación del panel</w:t>
       </w:r>
     </w:p>
     <w:p>
@@ -594,16 +658,39 @@
         </w:tabs>
       </w:pPr>
       <w:r>
-        <w:t>Aquí podemos ver las fotos de nuestros nodos cada uno con diferente radio, como son xbee, lora, y nrf,</w:t>
-      </w:r>
-      <w:r>
-        <w:t>como pueden ver,</w:t>
+        <w:t xml:space="preserve">Aquí podemos ver las fotos de nuestros nodos cada uno con diferente radio, como son </w:t>
+      </w:r>
+      <w:proofErr w:type="spellStart"/>
+      <w:r>
+        <w:t>xbee</w:t>
+      </w:r>
+      <w:proofErr w:type="spellEnd"/>
+      <w:r>
+        <w:t xml:space="preserve">, lora, y </w:t>
+      </w:r>
+      <w:proofErr w:type="spellStart"/>
+      <w:proofErr w:type="gramStart"/>
+      <w:r>
+        <w:t>nrf,</w:t>
+      </w:r>
+      <w:r>
+        <w:t>como</w:t>
+      </w:r>
+      <w:proofErr w:type="spellEnd"/>
+      <w:proofErr w:type="gramEnd"/>
+      <w:r>
+        <w:t xml:space="preserve"> pueden ver,</w:t>
       </w:r>
       <w:r>
         <w:t xml:space="preserve"> todos estos usaban el mismo código de configuración utilizando nuestra herramienta </w:t>
       </w:r>
-      <w:r>
-        <w:t xml:space="preserve">UniversalRadioWSN de esta manera solo cambiamos una línea para prepararlo para diferente hardware </w:t>
+      <w:proofErr w:type="spellStart"/>
+      <w:r>
+        <w:t>UniversalRadioWSN</w:t>
+      </w:r>
+      <w:proofErr w:type="spellEnd"/>
+      <w:r>
+        <w:t xml:space="preserve"> de esta manera solo cambiamos una línea para prepararlo para diferente hardware </w:t>
       </w:r>
       <w:r>
         <w:t xml:space="preserve"> </w:t>
@@ -626,13 +713,26 @@
         </w:tabs>
       </w:pPr>
       <w:r>
-        <w:t>Librería UniversalRadioWSN,</w:t>
+        <w:t xml:space="preserve">Librería </w:t>
+      </w:r>
+      <w:proofErr w:type="spellStart"/>
+      <w:proofErr w:type="gramStart"/>
+      <w:r>
+        <w:t>UniversalRadioWSN</w:t>
+      </w:r>
+      <w:proofErr w:type="spellEnd"/>
+      <w:r>
+        <w:t>,</w:t>
       </w:r>
       <w:r>
         <w:t xml:space="preserve"> </w:t>
       </w:r>
       <w:r>
-        <w:t xml:space="preserve"> como resultado tenemos la librería universal radio que es genérica para los módulos de radio que ya mencionamos y est</w:t>
+        <w:t xml:space="preserve"> como</w:t>
+      </w:r>
+      <w:proofErr w:type="gramEnd"/>
+      <w:r>
+        <w:t xml:space="preserve"> resultado tenemos la librería universal radio que es genérica para los módulos de radio que ya mencionamos y est</w:t>
       </w:r>
       <w:r>
         <w:t>a</w:t>
@@ -658,7 +758,15 @@
         </w:tabs>
       </w:pPr>
       <w:r>
-        <w:t>Tenemos la librería codec que se creó para poder contactar los datos a un formato binario con lo cual el tamaño del mensaje que se envía comparado a prototipos básicos se ve reducido hasta el 70% lo que reducen mucho el tiempo de transmisión y por lo tanto reduce el consumo de energía, A su vez dentro de esta misma librería implementamos algoritmos de verificación del mensaje para saber si nuestro mensaje se vio corrompido durante el envío o si le faltan partes para evitar sesgo</w:t>
+        <w:t xml:space="preserve">Tenemos la librería </w:t>
+      </w:r>
+      <w:proofErr w:type="spellStart"/>
+      <w:r>
+        <w:t>codec</w:t>
+      </w:r>
+      <w:proofErr w:type="spellEnd"/>
+      <w:r>
+        <w:t xml:space="preserve"> que se creó para poder contactar los datos a un formato binario con lo cual el tamaño del mensaje que se envía comparado a prototipos básicos se ve reducido hasta el 70% lo que reducen mucho el tiempo de transmisión y por lo tanto reduce el consumo de energía, A su vez dentro de esta misma librería implementamos algoritmos de verificación del mensaje para saber si nuestro mensaje se vio corrompido durante el envío o si le faltan partes para evitar sesgo</w:t>
       </w:r>
       <w:r>
         <w:t>.</w:t>
@@ -732,22 +840,54 @@
       </w:r>
       <w:r>
         <w:lastRenderedPageBreak/>
-        <w:t>diferentes hardware y radios con el objetivo de evaluar qué tanto mejoró el consumo tanto en modo de reposo así como el modo de trabajo y obtener la autonomía estimada de cada una de las variantes</w:t>
-      </w:r>
-    </w:p>
-    <w:p>
-      <w:pPr>
-        <w:tabs>
-          <w:tab w:val="num" w:pos="720"/>
-        </w:tabs>
-      </w:pPr>
-      <w:r>
-        <w:t>Como podemos ver en esta gráfica ,en el nodo más básico que era el nodo base utilizando la radio LoRa, obteníamos 2 días y medio de autonomía y el mejor resultado que obtuvimos nos da 38 días de autonomía aplicando todas nuestras mejoras tanto de hardware como de software</w:t>
-      </w:r>
-    </w:p>
-    <w:p>
-      <w:r>
-        <w:t>A su vez en esta diapositiva pueden ver un análisis en el que comparamos la reducción del tiempo de trabajo de El nodo basado en hora aplicando la librería codec que hace que la radio trabaje menos tiempo, Como se puede apreciar obtuvimos 50% menos de tiempo de trabajo usando la radio LoRa  y en los otros una reducción de más del 70%.  Lo que nos confirma que la reducción del tamaño del paquete a enviar, realmente es muy importante para reducir el consumo y aumentar la autonomía energética</w:t>
+        <w:t xml:space="preserve">diferentes hardware y radios con el objetivo de evaluar qué tanto mejoró el consumo tanto en modo de </w:t>
+      </w:r>
+      <w:proofErr w:type="gramStart"/>
+      <w:r>
+        <w:t>reposo</w:t>
+      </w:r>
+      <w:proofErr w:type="gramEnd"/>
+      <w:r>
+        <w:t xml:space="preserve"> así como el modo de trabajo y obtener la autonomía estimada de cada una de las variantes</w:t>
+      </w:r>
+    </w:p>
+    <w:p>
+      <w:pPr>
+        <w:tabs>
+          <w:tab w:val="num" w:pos="720"/>
+        </w:tabs>
+      </w:pPr>
+      <w:r>
+        <w:t xml:space="preserve">Como podemos ver en esta </w:t>
+      </w:r>
+      <w:proofErr w:type="gramStart"/>
+      <w:r>
+        <w:t>gráfica ,en</w:t>
+      </w:r>
+      <w:proofErr w:type="gramEnd"/>
+      <w:r>
+        <w:t xml:space="preserve"> el nodo más básico que era el nodo base utilizando la radio LoRa, obteníamos 2 días y medio de autonomía y el mejor resultado que obtuvimos nos da 38 días de autonomía aplicando todas nuestras mejoras tanto de hardware como de software</w:t>
+      </w:r>
+    </w:p>
+    <w:p>
+      <w:r>
+        <w:t xml:space="preserve">A su vez en esta diapositiva pueden ver un análisis en el que comparamos la reducción del tiempo de trabajo de El nodo basado en hora aplicando la librería </w:t>
+      </w:r>
+      <w:proofErr w:type="spellStart"/>
+      <w:r>
+        <w:t>codec</w:t>
+      </w:r>
+      <w:proofErr w:type="spellEnd"/>
+      <w:r>
+        <w:t xml:space="preserve"> que hace que la radio trabaje menos tiempo, Como se puede apreciar obtuvimos 50% menos de tiempo de trabajo usando la radio </w:t>
+      </w:r>
+      <w:proofErr w:type="gramStart"/>
+      <w:r>
+        <w:t>LoRa  y</w:t>
+      </w:r>
+      <w:proofErr w:type="gramEnd"/>
+      <w:r>
+        <w:t xml:space="preserve"> en los otros una reducción de más del 70%.  Lo que nos confirma que la reducción del tamaño del paquete a enviar, realmente es muy importante para reducir el consumo y aumentar la autonomía energética</w:t>
       </w:r>
     </w:p>
     <w:p/>
@@ -761,10 +901,18 @@
         <w:t xml:space="preserve">La realización de estas herramientas servirán de guía y apoyo a que más proyectos tanto del </w:t>
       </w:r>
       <w:r>
-        <w:t xml:space="preserve">Centro de Innovación, </w:t>
-      </w:r>
-      <w:r>
-        <w:t xml:space="preserve"> como en general pasen de la fase de prototipado</w:t>
+        <w:t xml:space="preserve">Centro de </w:t>
+      </w:r>
+      <w:proofErr w:type="gramStart"/>
+      <w:r>
+        <w:t xml:space="preserve">Innovación, </w:t>
+      </w:r>
+      <w:r>
+        <w:t xml:space="preserve"> como</w:t>
+      </w:r>
+      <w:proofErr w:type="gramEnd"/>
+      <w:r>
+        <w:t xml:space="preserve"> en general pasen de la fase de prototipado</w:t>
       </w:r>
       <w:r>
         <w:t>,</w:t>
@@ -833,17 +981,49 @@
     </w:p>
     <w:p>
       <w:r>
-        <w:t xml:space="preserve">Para el trabajo futuro nosotros recomendamos el reemplazo del reguladores sensores que nosotros utilizamos de bajo de costo por unos componentes procrecionales los cuales son más durables y eficientes energéticamente, </w:t>
-      </w:r>
-    </w:p>
-    <w:p>
-      <w:r>
-        <w:t>A su vez se puede mejorar el que la librería adapteive no solo reaccione al voltaje de la batería sino también a la energía que está disponible por el panel solar es decir que en días nublados transmita menos y en días soleados transmita más</w:t>
-      </w:r>
-    </w:p>
-    <w:p>
-      <w:r>
-        <w:t>A su vez , para un proyecto específico que ya se vaya a implementar, se recomienda arduamente diseñar una placa de circuito impreso personalizada ya que es más estable además de que reduce el tamaño y se tiene un mayor control</w:t>
+        <w:t xml:space="preserve">Para el trabajo futuro nosotros recomendamos el reemplazo </w:t>
+      </w:r>
+      <w:proofErr w:type="gramStart"/>
+      <w:r>
+        <w:t>del reguladores</w:t>
+      </w:r>
+      <w:proofErr w:type="gramEnd"/>
+      <w:r>
+        <w:t xml:space="preserve"> sensores que nosotros utilizamos de bajo de costo por unos componentes </w:t>
+      </w:r>
+      <w:proofErr w:type="spellStart"/>
+      <w:r>
+        <w:t>procrecionales</w:t>
+      </w:r>
+      <w:proofErr w:type="spellEnd"/>
+      <w:r>
+        <w:t xml:space="preserve"> los cuales son más durables y eficientes energéticamente, </w:t>
+      </w:r>
+    </w:p>
+    <w:p>
+      <w:r>
+        <w:t xml:space="preserve">A su vez se puede mejorar el que la librería </w:t>
+      </w:r>
+      <w:proofErr w:type="spellStart"/>
+      <w:r>
+        <w:t>adapteive</w:t>
+      </w:r>
+      <w:proofErr w:type="spellEnd"/>
+      <w:r>
+        <w:t xml:space="preserve"> no solo reaccione al voltaje de la batería sino también a la energía que está disponible por el panel solar es decir que en días nublados transmita menos y en días soleados transmita más</w:t>
+      </w:r>
+    </w:p>
+    <w:p>
+      <w:r>
+        <w:t xml:space="preserve">A su </w:t>
+      </w:r>
+      <w:proofErr w:type="gramStart"/>
+      <w:r>
+        <w:t>vez ,</w:t>
+      </w:r>
+      <w:proofErr w:type="gramEnd"/>
+      <w:r>
+        <w:t xml:space="preserve"> para un proyecto específico que ya se vaya a implementar, se recomienda arduamente diseñar una placa de circuito impreso personalizada ya que es más estable además de que reduce el tamaño y se tiene un mayor control</w:t>
       </w:r>
     </w:p>
     <w:p/>

</xml_diff>